<commit_message>
Terminos legales: clausulas de proteccion para Remesas IA (exoneracion, limite de responsabilidad, indemnidad, ley aplicable y arbitraje)
Co-Authored-By: Claude Sonnet 5.5 <noreply@anthropic.com>
</commit_message>
<xml_diff>
--- a/TÉRMINOS LEGALES Y DE USO DE REMESAS IA.docx
+++ b/TÉRMINOS LEGALES Y DE USO DE REMESAS IA.docx
@@ -243,6 +243,38 @@
         <w:rPr>
           <w:b/>
         </w:rPr>
+        <w:t>Naturaleza del servicio y ausencia de intermediación financiera:</w:t>
+      </w:r>
+    </w:p>
+    <w:p>
+      <w:pPr>
+        <w:spacing w:after="120"/>
+      </w:pPr>
+      <w:r>
+        <w:t>REMESAS IA es exclusivamente una herramienta tecnológica (software) de gestión y organización. REMESAS IA NO es una entidad financiera, banco, casa de cambio, empresa de envío o transferencia de dinero, ni entidad de pagos; NO recibe, retiene, custodia, administra ni transfiere fondos de remesas; NO es parte de las operaciones entre los operadores, los clientes finales y los beneficiarios; y NO presta asesoría financiera, legal, tributaria ni cambiaria. Todo depósito y toda transferencia se realiza directamente entre los operadores, los clientes y los beneficiarios, por los medios de pago que ellos mismos configuran y bajo su exclusiva responsabilidad.</w:t>
+      </w:r>
+    </w:p>
+    <w:p>
+      <w:r>
+        <w:rPr>
+          <w:b/>
+        </w:rPr>
+        <w:t>Sobre la relación con los clientes finales y beneficiarios:</w:t>
+      </w:r>
+    </w:p>
+    <w:p>
+      <w:pPr>
+        <w:spacing w:after="120"/>
+      </w:pPr>
+      <w:r>
+        <w:t>Los clientes finales y los beneficiarios son clientes del Usuario principal, no de REMESAS IA. REMESAS IA no tiene relación contractual, de representación ni fiduciaria con ellos. El Usuario principal es el único responsable ante sus clientes y beneficiarios por la prestación del servicio de remesas, por la veracidad de las tasas y comisiones que informa, por los plazos de entrega, por los errores, retrasos, pérdidas, fraudes o reclamos que se originen en la operación, y por los términos que aplique a sus propios clientes.</w:t>
+      </w:r>
+    </w:p>
+    <w:p>
+      <w:r>
+        <w:rPr>
+          <w:b/>
+        </w:rPr>
         <w:t>Sobre la responsabilidad por corredor y el cumplimiento normativo:</w:t>
       </w:r>
     </w:p>
@@ -251,15 +283,7 @@
         <w:spacing w:after="120"/>
       </w:pPr>
       <w:r>
-        <w:t>REMESAS IA es una herramienta tecnológica de gestión: NO es una entidad financiera, banco, casa de cambio ni empresa de transferencia de fondos, y NO recibe, custodia ni transfiere el dinero de las remesas. Los depósitos y transferencias los realizan directamente los operadores y los clientes por los medios de pago que ellos mismos configuran.</w:t>
-      </w:r>
-    </w:p>
-    <w:p>
-      <w:pPr>
-        <w:spacing w:after="120"/>
-      </w:pPr>
-      <w:r>
-        <w:t>Cada Usuario principal es el único responsable de contar con las autorizaciones, registros y licencias que exija la ley de cada país donde opere un corredor; de cumplir las normas cambiarias, de prevención de lavado de activos y de conocimiento del cliente que apliquen; y de sus obligaciones tributarias, en el país de recepción y en el país de entrega.</w:t>
+        <w:t>Cada Usuario principal es el único responsable de contar con las autorizaciones, registros, inscripciones y licencias que exija la ley de cada país donde opere un corredor; de cumplir las normas cambiarias, de prevención del lavado de activos y financiamiento del terrorismo, de conocimiento del cliente (KYC), de protección al consumidor, de comercio exterior y de migración que apliquen; y de sus obligaciones tributarias, tanto en el país de recepción como en el país de entrega. REMESAS IA no verifica ni supervisa el cumplimiento normativo de sus Usuarios y no asume responsabilidad alguna por su incumplimiento. REMESAS IA podrá suspender cuentas y cooperar con las autoridades competentes cuando exista una orden legal o indicios de uso ilícito.</w:t>
       </w:r>
     </w:p>
     <w:p>
@@ -275,7 +299,7 @@
         <w:spacing w:after="120"/>
       </w:pPr>
       <w:r>
-        <w:t>La tasa de cambio del día y la tasa de adquisición de cada corredor las fija y publica el Operador principal; REMESAS IA no garantiza ni interviene en esos valores. Las comisiones de los operadores del país de recepción y del país de entrega son fijadas por el Operador principal, pueden ser distintas por corredor y se congelan en cada operación al validarse el depósito en el país de entrega. Los montos de cada operación se expresan en la moneda de recepción de su corredor; las estadísticas consolidadas se muestran separadas por moneda y nunca se suman monedas distintas. Los valores en dólares mostrados en la plataforma son informativos.</w:t>
+        <w:t>La tasa de cambio del día y la tasa de adquisición de cada corredor las fija y publica el Operador principal; REMESAS IA no las determina, no las garantiza ni interviene en ellas, y no responde por pérdidas, diferenciales cambiarios o ganancias no obtenidas derivadas de esos valores. Las comisiones de los operadores del país de recepción y del país de entrega son fijadas por el Operador principal, pueden ser distintas por corredor y se congelan en cada operación al validarse el depósito en el país de entrega. Los montos de cada operación se expresan en la moneda de recepción de su corredor; las estadísticas consolidadas se muestran separadas por moneda y nunca se suman monedas distintas. Los valores del BCV, de la SUNAT y cualquier equivalente en dólares mostrado en la plataforma son meramente informativos y provienen de fuentes de terceros: pueden diferir de los valores del mercado y no deben usarse como único sustento de una operación.</w:t>
       </w:r>
     </w:p>
     <w:p>
@@ -283,7 +307,7 @@
         <w:rPr>
           <w:b/>
         </w:rPr>
-        <w:t>Sobre la limitación y responsabilidad:</w:t>
+        <w:t>Sobre la exoneración y limitación de responsabilidad:</w:t>
       </w:r>
     </w:p>
     <w:p>
@@ -291,7 +315,55 @@
         <w:spacing w:after="120"/>
       </w:pPr>
       <w:r>
-        <w:t>El servicio de REMESAS IA no se hace responsable de reclamos e indemnizaciones (daños, pérdidas, perjuicios u otra índole) que partan directamente de los resultados obtenidos de la atención oportuna de los clientes finales o del uso propio; los resultados dependen de la atención de los operadores, que deben ser personal calificado e idóneo para la atención oportuna del servicio que prestan. REMESAS IA tampoco se responsabiliza por errores en los datos ingresados por los usuarios, por demoras o fallas de bancos, billeteras digitales o proveedores de mensajería, ni por pérdidas derivadas de las tasas publicadas por el Operador principal.</w:t>
+        <w:t>El servicio se presta "tal cual" y "según disponibilidad", sin garantías expresas ni implícitas de ningún tipo (incluidas las de comerciabilidad, idoneidad para un fin particular, resultados, ausencia total de errores o disponibilidad ininterrumpida). El DEMO se entrega sin garantía alguna.</w:t>
+      </w:r>
+    </w:p>
+    <w:p>
+      <w:pPr>
+        <w:spacing w:after="120"/>
+      </w:pPr>
+      <w:r>
+        <w:t>En la máxima medida permitida por la ley, REMESAS IA, su titular, desarrolladores y colaboradores NO serán responsables por: (a) pérdidas, retrasos, errores, fraudes, suplantaciones o robos de fondos en las operaciones entre operadores, clientes y beneficiarios; (b) la atención oportuna o inadecuada de los operadores; (c) los datos ingresados por los usuarios o su veracidad; (d) fallas, demoras o bloqueos de bancos, billeteras digitales, PayPal, WhatsApp, Telegram, proveedores de internet o cualquier otro tercero; (e) cambios regulatorios, medidas de autoridades o decisiones de entidades financieras; (f) interrupciones del servicio por mantenimiento, actualizaciones, fallas técnicas, ataques informáticos o causas de fuerza mayor o caso fortuito; (g) lucro cesante, pérdida de clientes, de oportunidades de negocio, de datos o de reputación, ni cualquier daño indirecto, incidental, especial, consecuencial o punitivo; ni (h) el uso que el Usuario o sus operadores hagan de la plataforma contrario a estos términos o a la ley.</w:t>
+      </w:r>
+    </w:p>
+    <w:p>
+      <w:pPr>
+        <w:spacing w:after="120"/>
+      </w:pPr>
+      <w:r>
+        <w:t>Si a pesar de lo anterior se determinara alguna responsabilidad de REMESAS IA frente a un Usuario, ésta quedará limitada, en su monto total y por todos los conceptos, al importe efectivamente pagado por ese Usuario por su suscripción durante los tres (3) meses anteriores al hecho que originó el reclamo. Los reclamos deben presentarse por escrito dentro de los noventa (90) días siguientes al hecho que los origina; vencido ese plazo se entenderán renunciados en la medida que la ley lo permita.</w:t>
+      </w:r>
+    </w:p>
+    <w:p>
+      <w:r>
+        <w:rPr>
+          <w:b/>
+        </w:rPr>
+        <w:t>Sobre la indemnidad:</w:t>
+      </w:r>
+    </w:p>
+    <w:p>
+      <w:pPr>
+        <w:spacing w:after="120"/>
+      </w:pPr>
+      <w:r>
+        <w:t>El Usuario principal se obliga a defender, indemnizar y mantener indemne a REMESAS IA, a su titular, a sus desarrolladores y colaboradores frente a cualquier reclamo, demanda, sanción, multa, pérdida, daño y gasto (incluidos honorarios razonables de abogados) presentado por clientes finales, beneficiarios, operadores, autoridades, entidades financieras u otros terceros, que se derive de: (i) las operaciones de remesas que gestione con la plataforma; (ii) el incumplimiento de estos términos o de la ley; (iii) el uso de la plataforma por él o por su equipo; o (iv) los datos personales de sus clientes y beneficiarios que trate.</w:t>
+      </w:r>
+    </w:p>
+    <w:p>
+      <w:r>
+        <w:rPr>
+          <w:b/>
+        </w:rPr>
+        <w:t>Sobre servicios de terceros y disponibilidad:</w:t>
+      </w:r>
+    </w:p>
+    <w:p>
+      <w:pPr>
+        <w:spacing w:after="120"/>
+      </w:pPr>
+      <w:r>
+        <w:t>La plataforma se integra con servicios de terceros (entre ellos Google, WhatsApp, Telegram, PayPal, Supabase, Vercel, BCV y SUNAT) cuyo funcionamiento, términos, costos y disponibilidad no controla REMESAS IA. REMESAS IA realiza esfuerzos razonables para mantener el servicio disponible, pero no garantiza un nivel de disponibilidad, y puede modificar, suspender o discontinuar funciones con aviso razonable cuando sea posible.</w:t>
       </w:r>
     </w:p>
     <w:p>
@@ -435,7 +507,7 @@
         <w:spacing w:after="120"/>
       </w:pPr>
       <w:r>
-        <w:t>El uso de REMESAS IA prohíbe el spam, el abuso de cualquier índole, la ingeniería inversa y la reventa. También prohíbe usar la plataforma para actividades ilícitas, incluidas el lavado de activos y el financiamiento de actividades delictivas.</w:t>
+        <w:t>El uso de REMESAS IA prohíbe el spam, el abuso de cualquier índole, la ingeniería inversa y la reventa. También prohíbe usar la plataforma para actividades ilícitas, incluidas el lavado de activos, el financiamiento de actividades delictivas, el fraude y la suplantación de identidad, así como registrar datos de terceros sin su autorización.</w:t>
       </w:r>
     </w:p>
     <w:p>
@@ -483,6 +555,14 @@
         <w:spacing w:after="120"/>
       </w:pPr>
       <w:r>
+        <w:t>Para los datos personales de los clientes finales, beneficiarios y operadores que el Usuario principal registra, el Usuario principal actúa como titular del banco de datos / responsable del tratamiento y REMESAS IA como encargado del tratamiento, que solo los procesa para prestar el servicio. El Usuario principal es responsable de informar a esas personas, de obtener sus consentimientos y de cumplir la normativa de protección de datos personales aplicable en cada país donde opere (en Perú, la Ley N.º 29733 y su reglamento, y las normas equivalentes de los demás países).</w:t>
+      </w:r>
+    </w:p>
+    <w:p>
+      <w:pPr>
+        <w:spacing w:after="120"/>
+      </w:pPr>
+      <w:r>
         <w:t>REMESAS IA mantiene la privacidad y la confidencialidad de los datos de todos los Usuarios (nombres, apellidos, correo electrónico, teléfono, documento de identidad, país de residencia) y de sus clientes y beneficiarios. Estos datos son de uso estrictamente para la administración de usuarios, la gestión de las remesas, la comunicación del soporte técnico y las solicitudes de los usuarios para que sus datos sean eliminados. Los datos y el contenido de la cuenta (clientes, beneficiarios, solicitudes y operaciones de remesas de todos los corredores) se guardan en la base de datos de REMESAS IA mientras el Usuario mantenga un plan en el sistema, bajo la normativa de protección de datos personales aplicable en cada país.</w:t>
       </w:r>
     </w:p>
@@ -523,6 +603,38 @@
         <w:pStyle w:val="Heading1"/>
       </w:pPr>
       <w:r>
+        <w:t>LEY APLICABLE, SOLUCIÓN DE CONTROVERSIAS Y DISPOSICIONES GENERALES</w:t>
+      </w:r>
+    </w:p>
+    <w:p>
+      <w:pPr>
+        <w:spacing w:after="120"/>
+      </w:pPr>
+      <w:r>
+        <w:t>Estos términos se rigen por las leyes de la República del Perú, país de domicilio del titular, sin perjuicio de las normas imperativas de otros países que resulten aplicables al Usuario. El Usuario declara que usa REMESAS IA con fines comerciales o profesionales.</w:t>
+      </w:r>
+    </w:p>
+    <w:p>
+      <w:pPr>
+        <w:spacing w:after="120"/>
+      </w:pPr>
+      <w:r>
+        <w:t>Las partes procurarán resolver cualquier controversia mediante negociación directa de buena fe durante treinta (30) días calendario contados desde la comunicación escrita del reclamo al contacto oficial. De no resolverse, se someterá a conciliación y, de persistir, a arbitraje de derecho con sede en Lima, Perú, ante un centro de arbitraje reconocido, por un árbitro único, en idioma español. Para medidas cautelares o de protección de propiedad intelectual las partes podrán acudir a los tribunales competentes de Lima. En la medida que la ley lo permita, las controversias se resolverán de forma individual y no como acción colectiva o de clase.</w:t>
+      </w:r>
+    </w:p>
+    <w:p>
+      <w:pPr>
+        <w:spacing w:after="120"/>
+      </w:pPr>
+      <w:r>
+        <w:t>Si alguna disposición de estos términos fuera declarada nula o inaplicable, las demás conservarán su validez. La falta de ejercicio de un derecho no implica renuncia al mismo. Estos términos constituyen el acuerdo íntegro entre las partes sobre el uso de REMESAS IA y reemplazan versiones anteriores. REMESAS IA puede modificarlos y comunicará los cambios por su sitio web o por la sesión del Usuario; el uso continuado después del aviso implica su aceptación. El Usuario no puede ceder sus derechos sin autorización escrita de REMESAS IA.</w:t>
+      </w:r>
+    </w:p>
+    <w:p>
+      <w:pPr>
+        <w:pStyle w:val="Heading1"/>
+      </w:pPr>
+      <w:r>
         <w:t>ACEPTACIÓN</w:t>
       </w:r>
     </w:p>
@@ -547,7 +659,7 @@
         <w:spacing w:after="120"/>
       </w:pPr>
       <w:r>
-        <w:t>Correo: Productosaas@gmail.com - WhatsApp: https://wa.me/51960442025 - Página oficial: https://remesas-peru-venezuela-saas.vercel.app/</w:t>
+        <w:t>Productosaas@gmail.com, https://wa.me/51960442025 . Página oficial: https://remesas-peru-venezuela-saas.vercel.app/</w:t>
       </w:r>
     </w:p>
     <w:sectPr>

</xml_diff>